<commit_message>
TZ v2.1: Practice these / drill mode documented, backlog updated
</commit_message>
<xml_diff>
--- a/TZ_Quizzical_Club_EN.docx
+++ b/TZ_Quizzical_Club_EN.docx
@@ -178,7 +178,7 @@
                 <w:b w:val="false"/>
                 <w:bCs w:val="false"/>
               </w:rPr>
-              <w:t xml:space="preserve">2.0 (living template)</w:t>
+              <w:t xml:space="preserve">2.1 (living template)</w:t>
             </w:r>
           </w:p>
         </w:tc>
@@ -1473,7 +1473,7 @@
                 <w:b w:val="false"/>
                 <w:bCs w:val="false"/>
               </w:rPr>
-              <w:t xml:space="preserve">53 unit (vitest) + 88 e2e (playwright, desktop + mobile)</w:t>
+              <w:t xml:space="preserve">57 unit (vitest) + 90 e2e (playwright, desktop + mobile)</w:t>
             </w:r>
           </w:p>
         </w:tc>
@@ -1646,7 +1646,7 @@
         <w:spacing w:after="60"/>
       </w:pPr>
       <w:r>
-        <w:t xml:space="preserve">Wagered final round; winner screen with standings and Training notes: this game's hardest categories plus the all-time drill list.</w:t>
+        <w:t xml:space="preserve">Wagered final round; winner screen with standings and Training notes: hardest categories, all-time drill list, and a 'Practice these' button opening a workbook drill test on the missed categories.</w:t>
       </w:r>
     </w:p>
     <w:p>
@@ -1709,6 +1709,19 @@
       </w:pPr>
       <w:r>
         <w:t xml:space="preserve">Fuzzy answer checking (typos, articles, '/' alternates); results 'X of N' + percentage; best scores keyed by type × level × length; legacy bests migrate as N=10.</w:t>
+      </w:r>
+    </w:p>
+    <w:p>
+      <w:pPr>
+        <w:pStyle w:val="ListParagraph"/>
+        <w:numPr>
+          <w:ilvl w:val="0"/>
+          <w:numId w:val="2"/>
+        </w:numPr>
+        <w:spacing w:after="60"/>
+      </w:pPr>
+      <w:r>
+        <w:t xml:space="preserve">Drill mode from Training notes: a test on chosen categories (pool draws from the book dataset AND arena/classic boards); type/level filters disabled, length applies, no bests recorded.</w:t>
       </w:r>
     </w:p>
     <w:p>
@@ -2439,7 +2452,7 @@
         <w:spacing w:after="60"/>
       </w:pPr>
       <w:r>
-        <w:t xml:space="preserve">Unit (53): boards, part splitting (no losses/dupes, ×1–3 multipliers), set validity, workbook pools, matcher, saves &amp; migrations, stats, content anonymization.</w:t>
+        <w:t xml:space="preserve">Unit (57): boards, part splitting, drill pools, (no losses/dupes, ×1–3 multipliers), set validity, workbook pools, matcher, saves &amp; migrations, stats, content anonymization.</w:t>
       </w:r>
     </w:p>
     <w:p>
@@ -2452,7 +2465,7 @@
         <w:spacing w:after="60"/>
       </w:pPr>
       <w:r>
-        <w:t xml:space="preserve">E2E (88): team loop, workbook (incl. 5/10/20 lengths and persisted choice), guides, final toggle, early finish (cancel/results/final), marathon part 1 with exact 45,000 score, all 26 parts played to the podium with independently computed totals — desktop and mobile.</w:t>
+        <w:t xml:space="preserve">E2E (90): team loop, misses → Practice these → drill test scenario, workbook (incl. 5/10/20 lengths and persisted choice), guides, final toggle, early finish (cancel/results/final), marathon part 1 with exact 45,000 score, all 26 parts played to the podium with independently computed totals — desktop and mobile.</w:t>
       </w:r>
     </w:p>
     <w:p>
@@ -3229,19 +3242,6 @@
         <w:spacing w:after="60"/>
       </w:pPr>
       <w:r>
-        <w:t xml:space="preserve">'Practice these' button from the drill list → workbook test on the missed categories.</w:t>
-      </w:r>
-    </w:p>
-    <w:p>
-      <w:pPr>
-        <w:pStyle w:val="ListParagraph"/>
-        <w:numPr>
-          <w:ilvl w:val="0"/>
-          <w:numId w:val="2"/>
-        </w:numPr>
-        <w:spacing w:after="60"/>
-      </w:pPr>
-      <w:r>
         <w:t xml:space="preserve">Signed release AAB via repository secrets; TestFlight archive for iOS from CI.</w:t>
       </w:r>
     </w:p>
@@ -3686,6 +3686,60 @@
                 <w:bCs w:val="false"/>
               </w:rPr>
               <w:t xml:space="preserve">Sampling a mix game's boards at start</w:t>
+            </w:r>
+          </w:p>
+        </w:tc>
+      </w:tr>
+      <w:tr>
+        <w:tc>
+          <w:tcPr>
+            <w:tcW w:type="dxa" w:w="3000"/>
+            <w:tcBorders>
+              <w:top w:val="single" w:color="C9CFC9" w:sz="1"/>
+              <w:left w:val="single" w:color="C9CFC9" w:sz="1"/>
+              <w:bottom w:val="single" w:color="C9CFC9" w:sz="1"/>
+              <w:right w:val="single" w:color="C9CFC9" w:sz="1"/>
+            </w:tcBorders>
+            <w:tcMar>
+              <w:top w:type="dxa" w:w="80"/>
+              <w:left w:type="dxa" w:w="120"/>
+              <w:bottom w:type="dxa" w:w="80"/>
+              <w:right w:type="dxa" w:w="120"/>
+            </w:tcMar>
+          </w:tcPr>
+          <w:p>
+            <w:r>
+              <w:rPr>
+                <w:b w:val="false"/>
+                <w:bCs w:val="false"/>
+              </w:rPr>
+              <w:t xml:space="preserve">Drill mode</w:t>
+            </w:r>
+          </w:p>
+        </w:tc>
+        <w:tc>
+          <w:tcPr>
+            <w:tcW w:type="dxa" w:w="6026"/>
+            <w:tcBorders>
+              <w:top w:val="single" w:color="C9CFC9" w:sz="1"/>
+              <w:left w:val="single" w:color="C9CFC9" w:sz="1"/>
+              <w:bottom w:val="single" w:color="C9CFC9" w:sz="1"/>
+              <w:right w:val="single" w:color="C9CFC9" w:sz="1"/>
+            </w:tcBorders>
+            <w:tcMar>
+              <w:top w:type="dxa" w:w="80"/>
+              <w:left w:type="dxa" w:w="120"/>
+              <w:bottom w:type="dxa" w:w="80"/>
+              <w:right w:type="dxa" w:w="120"/>
+            </w:tcMar>
+          </w:tcPr>
+          <w:p>
+            <w:r>
+              <w:rPr>
+                <w:b w:val="false"/>
+                <w:bCs w:val="false"/>
+              </w:rPr>
+              <w:t xml:space="preserve">A workbook test on drill-list categories (podium → Practice these)</w:t>
             </w:r>
           </w:p>
         </w:tc>

</xml_diff>

<commit_message>
TZ v2.2: sidebar home, Daily Jeopardy, anglicization rule, verdicts, button font
</commit_message>
<xml_diff>
--- a/TZ_Quizzical_Club_EN.docx
+++ b/TZ_Quizzical_Club_EN.docx
@@ -178,7 +178,7 @@
                 <w:b w:val="false"/>
                 <w:bCs w:val="false"/>
               </w:rPr>
-              <w:t xml:space="preserve">2.1 (living template)</w:t>
+              <w:t xml:space="preserve">2.2 (living template)</w:t>
             </w:r>
           </w:p>
         </w:tc>
@@ -530,32 +530,9 @@
             <w:instrText xml:space="preserve">TOC \h \o "1-2"</w:instrText>
             <w:fldChar w:fldCharType="separate"/>
           </w:r>
-          <w:hyperlink w:history="1" w:anchor="_Toc25">
+          <w:hyperlink w:history="1" w:anchor="_Toc26">
             <w:r>
               <w:t xml:space="preserve">1. Overview</w:t>
-            </w:r>
-            <w:r>
-              <w:tab/>
-            </w:r>
-            <w:r>
-              <w:fldChar w:fldCharType="begin" w:dirty="true"/>
-              <w:instrText xml:space="preserve">PAGEREF _Toc25 \h</w:instrText>
-              <w:fldChar w:fldCharType="separate"/>
-              <w:fldChar w:fldCharType="end"/>
-            </w:r>
-          </w:hyperlink>
-        </w:p>
-        <w:p>
-          <w:pPr>
-            <w:pStyle w:val="TOC2"/>
-            <w:tabs>
-              <w:tab w:val="right" w:pos="9026" w:leader="dot"/>
-            </w:tabs>
-            <w:ind w:left="220"/>
-          </w:pPr>
-          <w:hyperlink w:history="1" w:anchor="_Toc26">
-            <w:r>
-              <w:t xml:space="preserve">1.1. Goals</w:t>
             </w:r>
             <w:r>
               <w:tab/>
@@ -578,7 +555,7 @@
           </w:pPr>
           <w:hyperlink w:history="1" w:anchor="_Toc27">
             <w:r>
-              <w:t xml:space="preserve">1.2. Key facts</w:t>
+              <w:t xml:space="preserve">1.1. Goals</w:t>
             </w:r>
             <w:r>
               <w:tab/>
@@ -586,28 +563,6 @@
             <w:r>
               <w:fldChar w:fldCharType="begin" w:dirty="true"/>
               <w:instrText xml:space="preserve">PAGEREF _Toc27 \h</w:instrText>
-              <w:fldChar w:fldCharType="separate"/>
-              <w:fldChar w:fldCharType="end"/>
-            </w:r>
-          </w:hyperlink>
-        </w:p>
-        <w:p>
-          <w:pPr>
-            <w:pStyle w:val="TOC1"/>
-            <w:tabs>
-              <w:tab w:val="right" w:pos="9026" w:leader="dot"/>
-            </w:tabs>
-          </w:pPr>
-          <w:hyperlink w:history="1" w:anchor="_Toc28">
-            <w:r>
-              <w:t xml:space="preserve">2. Current functionality</w:t>
-            </w:r>
-            <w:r>
-              <w:tab/>
-            </w:r>
-            <w:r>
-              <w:fldChar w:fldCharType="begin" w:dirty="true"/>
-              <w:instrText xml:space="preserve">PAGEREF _Toc28 \h</w:instrText>
               <w:fldChar w:fldCharType="separate"/>
               <w:fldChar w:fldCharType="end"/>
             </w:r>
@@ -621,9 +576,31 @@
             </w:tabs>
             <w:ind w:left="220"/>
           </w:pPr>
+          <w:hyperlink w:history="1" w:anchor="_Toc28">
+            <w:r>
+              <w:t xml:space="preserve">1.2. Key facts</w:t>
+            </w:r>
+            <w:r>
+              <w:tab/>
+            </w:r>
+            <w:r>
+              <w:fldChar w:fldCharType="begin" w:dirty="true"/>
+              <w:instrText xml:space="preserve">PAGEREF _Toc28 \h</w:instrText>
+              <w:fldChar w:fldCharType="separate"/>
+              <w:fldChar w:fldCharType="end"/>
+            </w:r>
+          </w:hyperlink>
+        </w:p>
+        <w:p>
+          <w:pPr>
+            <w:pStyle w:val="TOC1"/>
+            <w:tabs>
+              <w:tab w:val="right" w:pos="9026" w:leader="dot"/>
+            </w:tabs>
+          </w:pPr>
           <w:hyperlink w:history="1" w:anchor="_Toc29">
             <w:r>
-              <w:t xml:space="preserve">2.1. Team Jeopardy</w:t>
+              <w:t xml:space="preserve">2. Current functionality</w:t>
             </w:r>
             <w:r>
               <w:tab/>
@@ -646,7 +623,7 @@
           </w:pPr>
           <w:hyperlink w:history="1" w:anchor="_Toc30">
             <w:r>
-              <w:t xml:space="preserve">2.2. Workbook</w:t>
+              <w:t xml:space="preserve">2.1. Team Jeopardy</w:t>
             </w:r>
             <w:r>
               <w:tab/>
@@ -669,7 +646,7 @@
           </w:pPr>
           <w:hyperlink w:history="1" w:anchor="_Toc31">
             <w:r>
-              <w:t xml:space="preserve">2.3. Guides</w:t>
+              <w:t xml:space="preserve">2.2. Home &amp; Daily Jeopardy</w:t>
             </w:r>
             <w:r>
               <w:tab/>
@@ -692,7 +669,7 @@
           </w:pPr>
           <w:hyperlink w:history="1" w:anchor="_Toc32">
             <w:r>
-              <w:t xml:space="preserve">2.4. Content &amp; games</w:t>
+              <w:t xml:space="preserve">2.3. Workbook</w:t>
             </w:r>
             <w:r>
               <w:tab/>
@@ -715,7 +692,7 @@
           </w:pPr>
           <w:hyperlink w:history="1" w:anchor="_Toc33">
             <w:r>
-              <w:t xml:space="preserve">2.5. Mobile app</w:t>
+              <w:t xml:space="preserve">2.4. Guides</w:t>
             </w:r>
             <w:r>
               <w:tab/>
@@ -730,14 +707,15 @@
         </w:p>
         <w:p>
           <w:pPr>
-            <w:pStyle w:val="TOC1"/>
+            <w:pStyle w:val="TOC2"/>
             <w:tabs>
               <w:tab w:val="right" w:pos="9026" w:leader="dot"/>
             </w:tabs>
+            <w:ind w:left="220"/>
           </w:pPr>
           <w:hyperlink w:history="1" w:anchor="_Toc34">
             <w:r>
-              <w:t xml:space="preserve">3. Architecture</w:t>
+              <w:t xml:space="preserve">2.5. Content &amp; games</w:t>
             </w:r>
             <w:r>
               <w:tab/>
@@ -760,7 +738,7 @@
           </w:pPr>
           <w:hyperlink w:history="1" w:anchor="_Toc35">
             <w:r>
-              <w:t xml:space="preserve">3.1. Principles</w:t>
+              <w:t xml:space="preserve">2.6. Mobile app</w:t>
             </w:r>
             <w:r>
               <w:tab/>
@@ -775,15 +753,14 @@
         </w:p>
         <w:p>
           <w:pPr>
-            <w:pStyle w:val="TOC2"/>
+            <w:pStyle w:val="TOC1"/>
             <w:tabs>
               <w:tab w:val="right" w:pos="9026" w:leader="dot"/>
             </w:tabs>
-            <w:ind w:left="220"/>
           </w:pPr>
           <w:hyperlink w:history="1" w:anchor="_Toc36">
             <w:r>
-              <w:t xml:space="preserve">3.2. Repository layout</w:t>
+              <w:t xml:space="preserve">3. Architecture</w:t>
             </w:r>
             <w:r>
               <w:tab/>
@@ -806,7 +783,7 @@
           </w:pPr>
           <w:hyperlink w:history="1" w:anchor="_Toc37">
             <w:r>
-              <w:t xml:space="preserve">3.3. Team game lifecycle</w:t>
+              <w:t xml:space="preserve">3.1. Principles</w:t>
             </w:r>
             <w:r>
               <w:tab/>
@@ -821,14 +798,15 @@
         </w:p>
         <w:p>
           <w:pPr>
-            <w:pStyle w:val="TOC1"/>
+            <w:pStyle w:val="TOC2"/>
             <w:tabs>
               <w:tab w:val="right" w:pos="9026" w:leader="dot"/>
             </w:tabs>
+            <w:ind w:left="220"/>
           </w:pPr>
           <w:hyperlink w:history="1" w:anchor="_Toc38">
             <w:r>
-              <w:t xml:space="preserve">4. Testing &amp; quality</w:t>
+              <w:t xml:space="preserve">3.2. Repository layout</w:t>
             </w:r>
             <w:r>
               <w:tab/>
@@ -851,7 +829,7 @@
           </w:pPr>
           <w:hyperlink w:history="1" w:anchor="_Toc39">
             <w:r>
-              <w:t xml:space="preserve">4.1. CI/CD</w:t>
+              <w:t xml:space="preserve">3.3. Team game lifecycle</w:t>
             </w:r>
             <w:r>
               <w:tab/>
@@ -873,7 +851,7 @@
           </w:pPr>
           <w:hyperlink w:history="1" w:anchor="_Toc40">
             <w:r>
-              <w:t xml:space="preserve">5. How to add features</w:t>
+              <w:t xml:space="preserve">4. Testing &amp; quality</w:t>
             </w:r>
             <w:r>
               <w:tab/>
@@ -896,7 +874,7 @@
           </w:pPr>
           <w:hyperlink w:history="1" w:anchor="_Toc41">
             <w:r>
-              <w:t xml:space="preserve">5.1. New game from existing boards</w:t>
+              <w:t xml:space="preserve">4.1. CI/CD</w:t>
             </w:r>
             <w:r>
               <w:tab/>
@@ -911,15 +889,14 @@
         </w:p>
         <w:p>
           <w:pPr>
-            <w:pStyle w:val="TOC2"/>
+            <w:pStyle w:val="TOC1"/>
             <w:tabs>
               <w:tab w:val="right" w:pos="9026" w:leader="dot"/>
             </w:tabs>
-            <w:ind w:left="220"/>
           </w:pPr>
           <w:hyperlink w:history="1" w:anchor="_Toc42">
             <w:r>
-              <w:t xml:space="preserve">5.2. New content (a board / categories)</w:t>
+              <w:t xml:space="preserve">5. How to add features</w:t>
             </w:r>
             <w:r>
               <w:tab/>
@@ -942,7 +919,7 @@
           </w:pPr>
           <w:hyperlink w:history="1" w:anchor="_Toc43">
             <w:r>
-              <w:t xml:space="preserve">5.3. New workbook puzzle type</w:t>
+              <w:t xml:space="preserve">5.1. New game from existing boards</w:t>
             </w:r>
             <w:r>
               <w:tab/>
@@ -965,7 +942,7 @@
           </w:pPr>
           <w:hyperlink w:history="1" w:anchor="_Toc44">
             <w:r>
-              <w:t xml:space="preserve">5.4. New engine mechanic</w:t>
+              <w:t xml:space="preserve">5.2. New content (a board / categories)</w:t>
             </w:r>
             <w:r>
               <w:tab/>
@@ -988,7 +965,7 @@
           </w:pPr>
           <w:hyperlink w:history="1" w:anchor="_Toc45">
             <w:r>
-              <w:t xml:space="preserve">5.5. Code rules</w:t>
+              <w:t xml:space="preserve">5.3. New workbook puzzle type</w:t>
             </w:r>
             <w:r>
               <w:tab/>
@@ -1003,14 +980,15 @@
         </w:p>
         <w:p>
           <w:pPr>
-            <w:pStyle w:val="TOC1"/>
+            <w:pStyle w:val="TOC2"/>
             <w:tabs>
               <w:tab w:val="right" w:pos="9026" w:leader="dot"/>
             </w:tabs>
+            <w:ind w:left="220"/>
           </w:pPr>
           <w:hyperlink w:history="1" w:anchor="_Toc46">
             <w:r>
-              <w:t xml:space="preserve">6. Feature card template</w:t>
+              <w:t xml:space="preserve">5.4. New engine mechanic</w:t>
             </w:r>
             <w:r>
               <w:tab/>
@@ -1025,14 +1003,15 @@
         </w:p>
         <w:p>
           <w:pPr>
-            <w:pStyle w:val="TOC1"/>
+            <w:pStyle w:val="TOC2"/>
             <w:tabs>
               <w:tab w:val="right" w:pos="9026" w:leader="dot"/>
             </w:tabs>
+            <w:ind w:left="220"/>
           </w:pPr>
           <w:hyperlink w:history="1" w:anchor="_Toc47">
             <w:r>
-              <w:t xml:space="preserve">7. Backlog ideas</w:t>
+              <w:t xml:space="preserve">5.5. Code rules</w:t>
             </w:r>
             <w:r>
               <w:tab/>
@@ -1054,7 +1033,7 @@
           </w:pPr>
           <w:hyperlink w:history="1" w:anchor="_Toc48">
             <w:r>
-              <w:t xml:space="preserve">8. Glossary</w:t>
+              <w:t xml:space="preserve">6. Feature card template</w:t>
             </w:r>
             <w:r>
               <w:tab/>
@@ -1062,6 +1041,50 @@
             <w:r>
               <w:fldChar w:fldCharType="begin" w:dirty="true"/>
               <w:instrText xml:space="preserve">PAGEREF _Toc48 \h</w:instrText>
+              <w:fldChar w:fldCharType="separate"/>
+              <w:fldChar w:fldCharType="end"/>
+            </w:r>
+          </w:hyperlink>
+        </w:p>
+        <w:p>
+          <w:pPr>
+            <w:pStyle w:val="TOC1"/>
+            <w:tabs>
+              <w:tab w:val="right" w:pos="9026" w:leader="dot"/>
+            </w:tabs>
+          </w:pPr>
+          <w:hyperlink w:history="1" w:anchor="_Toc49">
+            <w:r>
+              <w:t xml:space="preserve">7. Backlog ideas</w:t>
+            </w:r>
+            <w:r>
+              <w:tab/>
+            </w:r>
+            <w:r>
+              <w:fldChar w:fldCharType="begin" w:dirty="true"/>
+              <w:instrText xml:space="preserve">PAGEREF _Toc49 \h</w:instrText>
+              <w:fldChar w:fldCharType="separate"/>
+              <w:fldChar w:fldCharType="end"/>
+            </w:r>
+          </w:hyperlink>
+        </w:p>
+        <w:p>
+          <w:pPr>
+            <w:pStyle w:val="TOC1"/>
+            <w:tabs>
+              <w:tab w:val="right" w:pos="9026" w:leader="dot"/>
+            </w:tabs>
+          </w:pPr>
+          <w:hyperlink w:history="1" w:anchor="_Toc50">
+            <w:r>
+              <w:t xml:space="preserve">8. Glossary</w:t>
+            </w:r>
+            <w:r>
+              <w:tab/>
+            </w:r>
+            <w:r>
+              <w:fldChar w:fldCharType="begin" w:dirty="true"/>
+              <w:instrText xml:space="preserve">PAGEREF _Toc50 \h</w:instrText>
               <w:fldChar w:fldCharType="separate"/>
               <w:fldChar w:fldCharType="end"/>
             </w:r>
@@ -1083,11 +1106,11 @@
       <w:pPr>
         <w:pStyle w:val="Heading1"/>
       </w:pPr>
-      <w:bookmarkStart w:name="_Toc25" w:id="25"/>
+      <w:bookmarkStart w:name="_Toc26" w:id="26"/>
       <w:r>
         <w:t xml:space="preserve">1. Overview</w:t>
       </w:r>
-      <w:bookmarkEnd w:id="25"/>
+      <w:bookmarkEnd w:id="26"/>
     </w:p>
     <w:p>
       <w:pPr>
@@ -1109,11 +1132,11 @@
       <w:pPr>
         <w:pStyle w:val="Heading2"/>
       </w:pPr>
-      <w:bookmarkStart w:name="_Toc26" w:id="26"/>
+      <w:bookmarkStart w:name="_Toc27" w:id="27"/>
       <w:r>
         <w:t xml:space="preserve">1.1. Goals</w:t>
       </w:r>
-      <w:bookmarkEnd w:id="26"/>
+      <w:bookmarkEnd w:id="27"/>
     </w:p>
     <w:p>
       <w:pPr>
@@ -1182,13 +1205,26 @@
     </w:p>
     <w:p>
       <w:pPr>
+        <w:pStyle w:val="ListParagraph"/>
+        <w:numPr>
+          <w:ilvl w:val="0"/>
+          <w:numId w:val="2"/>
+        </w:numPr>
+        <w:spacing w:after="60"/>
+      </w:pPr>
+      <w:r>
+        <w:t xml:space="preserve">English-only UI (olympiad immersion); Cyrillic in the build fails the tests.</w:t>
+      </w:r>
+    </w:p>
+    <w:p>
+      <w:pPr>
         <w:pStyle w:val="Heading2"/>
       </w:pPr>
-      <w:bookmarkStart w:name="_Toc27" w:id="27"/>
+      <w:bookmarkStart w:name="_Toc28" w:id="28"/>
       <w:r>
         <w:t xml:space="preserve">1.2. Key facts</w:t>
       </w:r>
-      <w:bookmarkEnd w:id="27"/>
+      <w:bookmarkEnd w:id="28"/>
     </w:p>
     <w:tbl>
       <w:tblPr>
@@ -1311,7 +1347,7 @@
                 <w:b w:val="false"/>
                 <w:bCs w:val="false"/>
               </w:rPr>
-              <w:t xml:space="preserve">17 — arenas I–IV, Arena Mix, 5 book sets, 7 classic sets</w:t>
+              <w:t xml:space="preserve">18 — arenas I–IV, Arena Mix, Daily Jeopardy, 5 book sets, 7 classic sets</w:t>
             </w:r>
           </w:p>
         </w:tc>
@@ -1365,7 +1401,7 @@
                 <w:b w:val="false"/>
                 <w:bCs w:val="false"/>
               </w:rPr>
-              <w:t xml:space="preserve">26 parts (long games split into ≤ 3 boards)</w:t>
+              <w:t xml:space="preserve">26 parts (≤ 3 boards each) + Daily Jeopardy on the home screen</w:t>
             </w:r>
           </w:p>
         </w:tc>
@@ -1473,7 +1509,7 @@
                 <w:b w:val="false"/>
                 <w:bCs w:val="false"/>
               </w:rPr>
-              <w:t xml:space="preserve">57 unit (vitest) + 90 e2e (playwright, desktop + mobile)</w:t>
+              <w:t xml:space="preserve">65 unit (vitest) + 96 e2e (playwright, desktop + mobile)</w:t>
             </w:r>
           </w:p>
         </w:tc>
@@ -1542,21 +1578,21 @@
       <w:pPr>
         <w:pStyle w:val="Heading1"/>
       </w:pPr>
-      <w:bookmarkStart w:name="_Toc28" w:id="28"/>
+      <w:bookmarkStart w:name="_Toc29" w:id="29"/>
       <w:r>
         <w:t xml:space="preserve">2. Current functionality</w:t>
       </w:r>
-      <w:bookmarkEnd w:id="28"/>
+      <w:bookmarkEnd w:id="29"/>
     </w:p>
     <w:p>
       <w:pPr>
         <w:pStyle w:val="Heading2"/>
       </w:pPr>
-      <w:bookmarkStart w:name="_Toc29" w:id="29"/>
+      <w:bookmarkStart w:name="_Toc30" w:id="30"/>
       <w:r>
         <w:t xml:space="preserve">2.1. Team Jeopardy</w:t>
       </w:r>
-      <w:bookmarkEnd w:id="29"/>
+      <w:bookmarkEnd w:id="30"/>
     </w:p>
     <w:p>
       <w:pPr>
@@ -1659,6 +1695,19 @@
         <w:spacing w:after="60"/>
       </w:pPr>
       <w:r>
+        <w:t xml:space="preserve">Permanent sidebar: logo + Guides/Workbook/Jeopardy with an active highlight; bottom bar on mobile; hidden during a live game.</w:t>
+      </w:r>
+    </w:p>
+    <w:p>
+      <w:pPr>
+        <w:pStyle w:val="ListParagraph"/>
+        <w:numPr>
+          <w:ilvl w:val="0"/>
+          <w:numId w:val="2"/>
+        </w:numPr>
+        <w:spacing w:after="60"/>
+      </w:pPr>
+      <w:r>
         <w:t xml:space="preserve">Web Audio synthesized SFX (no assets), mutable; reduced-motion supported.</w:t>
       </w:r>
     </w:p>
@@ -1666,11 +1715,11 @@
       <w:pPr>
         <w:pStyle w:val="Heading2"/>
       </w:pPr>
-      <w:bookmarkStart w:name="_Toc30" w:id="30"/>
-      <w:r>
-        <w:t xml:space="preserve">2.2. Workbook</w:t>
-      </w:r>
-      <w:bookmarkEnd w:id="30"/>
+      <w:bookmarkStart w:name="_Toc31" w:id="31"/>
+      <w:r>
+        <w:t xml:space="preserve">2.2. Home &amp; Daily Jeopardy</w:t>
+      </w:r>
+      <w:bookmarkEnd w:id="31"/>
     </w:p>
     <w:p>
       <w:pPr>
@@ -1682,6 +1731,42 @@
         <w:spacing w:after="60"/>
       </w:pPr>
       <w:r>
+        <w:t xml:space="preserve">The home screen centers on the Daily Jeopardy card: one 5×5 board (100–500) sampled from 5 random categories across every pool (books, UoE, classics), no duplicate names.</w:t>
+      </w:r>
+    </w:p>
+    <w:p>
+      <w:pPr>
+        <w:pStyle w:val="ListParagraph"/>
+        <w:numPr>
+          <w:ilvl w:val="0"/>
+          <w:numId w:val="2"/>
+        </w:numPr>
+        <w:spacing w:after="60"/>
+      </w:pPr>
+      <w:r>
+        <w:t xml:space="preserve">Seed = UTC calendar day: same board all day on the device; play → teams → board → podium straight away (no final by default).</w:t>
+      </w:r>
+    </w:p>
+    <w:p>
+      <w:pPr>
+        <w:pStyle w:val="Heading2"/>
+      </w:pPr>
+      <w:bookmarkStart w:name="_Toc32" w:id="32"/>
+      <w:r>
+        <w:t xml:space="preserve">2.3. Workbook</w:t>
+      </w:r>
+      <w:bookmarkEnd w:id="32"/>
+    </w:p>
+    <w:p>
+      <w:pPr>
+        <w:pStyle w:val="ListParagraph"/>
+        <w:numPr>
+          <w:ilvl w:val="0"/>
+          <w:numId w:val="2"/>
+        </w:numPr>
+        <w:spacing w:after="60"/>
+      </w:pPr>
+      <w:r>
         <w:t xml:space="preserve">10 puzzle types + 'Everything'; Easy / Medium / Hard level filter.</w:t>
       </w:r>
     </w:p>
@@ -1726,13 +1811,26 @@
     </w:p>
     <w:p>
       <w:pPr>
+        <w:pStyle w:val="ListParagraph"/>
+        <w:numPr>
+          <w:ilvl w:val="0"/>
+          <w:numId w:val="2"/>
+        </w:numPr>
+        <w:spacing w:after="60"/>
+      </w:pPr>
+      <w:r>
+        <w:t xml:space="preserve">Results screen: verdict phrase from the customer's scale (lib/verdict.ts, 11 bands across 0–100%, deliberately inverted top end).</w:t>
+      </w:r>
+    </w:p>
+    <w:p>
+      <w:pPr>
         <w:pStyle w:val="Heading2"/>
       </w:pPr>
-      <w:bookmarkStart w:name="_Toc31" w:id="31"/>
-      <w:r>
-        <w:t xml:space="preserve">2.3. Guides</w:t>
-      </w:r>
-      <w:bookmarkEnd w:id="31"/>
+      <w:bookmarkStart w:name="_Toc33" w:id="33"/>
+      <w:r>
+        <w:t xml:space="preserve">2.4. Guides</w:t>
+      </w:r>
+      <w:bookmarkEnd w:id="33"/>
     </w:p>
     <w:p>
       <w:pPr>
@@ -1751,11 +1849,11 @@
       <w:pPr>
         <w:pStyle w:val="Heading2"/>
       </w:pPr>
-      <w:bookmarkStart w:name="_Toc32" w:id="32"/>
-      <w:r>
-        <w:t xml:space="preserve">2.4. Content &amp; games</w:t>
-      </w:r>
-      <w:bookmarkEnd w:id="32"/>
+      <w:bookmarkStart w:name="_Toc34" w:id="34"/>
+      <w:r>
+        <w:t xml:space="preserve">2.5. Content &amp; games</w:t>
+      </w:r>
+      <w:bookmarkEnd w:id="34"/>
     </w:p>
     <w:tbl>
       <w:tblPr>
@@ -2118,11 +2216,11 @@
       <w:pPr>
         <w:pStyle w:val="Heading2"/>
       </w:pPr>
-      <w:bookmarkStart w:name="_Toc33" w:id="33"/>
-      <w:r>
-        <w:t xml:space="preserve">2.5. Mobile app</w:t>
-      </w:r>
-      <w:bookmarkEnd w:id="33"/>
+      <w:bookmarkStart w:name="_Toc35" w:id="35"/>
+      <w:r>
+        <w:t xml:space="preserve">2.6. Mobile app</w:t>
+      </w:r>
+      <w:bookmarkEnd w:id="35"/>
     </w:p>
     <w:p>
       <w:pPr>
@@ -2185,21 +2283,21 @@
       <w:pPr>
         <w:pStyle w:val="Heading1"/>
       </w:pPr>
-      <w:bookmarkStart w:name="_Toc34" w:id="34"/>
+      <w:bookmarkStart w:name="_Toc36" w:id="36"/>
       <w:r>
         <w:t xml:space="preserve">3. Architecture</w:t>
       </w:r>
-      <w:bookmarkEnd w:id="34"/>
+      <w:bookmarkEnd w:id="36"/>
     </w:p>
     <w:p>
       <w:pPr>
         <w:pStyle w:val="Heading2"/>
       </w:pPr>
-      <w:bookmarkStart w:name="_Toc35" w:id="35"/>
+      <w:bookmarkStart w:name="_Toc37" w:id="37"/>
       <w:r>
         <w:t xml:space="preserve">3.1. Principles</w:t>
       </w:r>
-      <w:bookmarkEnd w:id="35"/>
+      <w:bookmarkEnd w:id="37"/>
     </w:p>
     <w:p>
       <w:pPr>
@@ -2257,11 +2355,11 @@
       <w:pPr>
         <w:pStyle w:val="Heading2"/>
       </w:pPr>
-      <w:bookmarkStart w:name="_Toc36" w:id="36"/>
+      <w:bookmarkStart w:name="_Toc38" w:id="38"/>
       <w:r>
         <w:t xml:space="preserve">3.2. Repository layout</w:t>
       </w:r>
-      <w:bookmarkEnd w:id="36"/>
+      <w:bookmarkEnd w:id="38"/>
     </w:p>
     <w:p>
       <w:pPr>
@@ -2387,11 +2485,11 @@
       <w:pPr>
         <w:pStyle w:val="Heading2"/>
       </w:pPr>
-      <w:bookmarkStart w:name="_Toc37" w:id="37"/>
+      <w:bookmarkStart w:name="_Toc39" w:id="39"/>
       <w:r>
         <w:t xml:space="preserve">3.3. Team game lifecycle</w:t>
       </w:r>
-      <w:bookmarkEnd w:id="37"/>
+      <w:bookmarkEnd w:id="39"/>
     </w:p>
     <w:p>
       <w:pPr>
@@ -2436,11 +2534,11 @@
       <w:pPr>
         <w:pStyle w:val="Heading1"/>
       </w:pPr>
-      <w:bookmarkStart w:name="_Toc38" w:id="38"/>
+      <w:bookmarkStart w:name="_Toc40" w:id="40"/>
       <w:r>
         <w:t xml:space="preserve">4. Testing &amp; quality</w:t>
       </w:r>
-      <w:bookmarkEnd w:id="38"/>
+      <w:bookmarkEnd w:id="40"/>
     </w:p>
     <w:p>
       <w:pPr>
@@ -2452,7 +2550,7 @@
         <w:spacing w:after="60"/>
       </w:pPr>
       <w:r>
-        <w:t xml:space="preserve">Unit (57): boards, part splitting, drill pools, (no losses/dupes, ×1–3 multipliers), set validity, workbook pools, matcher, saves &amp; migrations, stats, content anonymization.</w:t>
+        <w:t xml:space="preserve">Unit (65): boards, part splitting, drill pools, daily board (date seed), verdict scale (boundaries + all of 0–100), zero-Cyrillic source scan with no exceptions, (no losses/dupes, ×1–3 multipliers), set validity, workbook pools, matcher, saves &amp; migrations, stats, content anonymization.</w:t>
       </w:r>
     </w:p>
     <w:p>
@@ -2465,7 +2563,7 @@
         <w:spacing w:after="60"/>
       </w:pPr>
       <w:r>
-        <w:t xml:space="preserve">E2E (90): team loop, misses → Practice these → drill test scenario, workbook (incl. 5/10/20 lengths and persisted choice), guides, final toggle, early finish (cancel/results/final), marathon part 1 with exact 45,000 score, all 26 parts played to the podium with independently computed totals — desktop and mobile.</w:t>
+        <w:t xml:space="preserve">E2E (96): sidebar navigation (desktop + mobile), Daily Jeopardy to the podium with exact 7,500, no Cyrillic in body text on any screen, team loop, misses → Practice these → drill test scenario, workbook (incl. 5/10/20 lengths and persisted choice), guides, final toggle, early finish (cancel/results/final), marathon part 1 with exact 45,000 score, all 26 parts played to the podium with independently computed totals — desktop and mobile.</w:t>
       </w:r>
     </w:p>
     <w:p>
@@ -2485,11 +2583,11 @@
       <w:pPr>
         <w:pStyle w:val="Heading2"/>
       </w:pPr>
-      <w:bookmarkStart w:name="_Toc39" w:id="39"/>
+      <w:bookmarkStart w:name="_Toc41" w:id="41"/>
       <w:r>
         <w:t xml:space="preserve">4.1. CI/CD</w:t>
       </w:r>
-      <w:bookmarkEnd w:id="39"/>
+      <w:bookmarkEnd w:id="41"/>
     </w:p>
     <w:p>
       <w:pPr>
@@ -2523,21 +2621,21 @@
       <w:pPr>
         <w:pStyle w:val="Heading1"/>
       </w:pPr>
-      <w:bookmarkStart w:name="_Toc40" w:id="40"/>
+      <w:bookmarkStart w:name="_Toc42" w:id="42"/>
       <w:r>
         <w:t xml:space="preserve">5. How to add features</w:t>
       </w:r>
-      <w:bookmarkEnd w:id="40"/>
+      <w:bookmarkEnd w:id="42"/>
     </w:p>
     <w:p>
       <w:pPr>
         <w:pStyle w:val="Heading2"/>
       </w:pPr>
-      <w:bookmarkStart w:name="_Toc41" w:id="41"/>
+      <w:bookmarkStart w:name="_Toc43" w:id="43"/>
       <w:r>
         <w:t xml:space="preserve">5.1. New game from existing boards</w:t>
       </w:r>
-      <w:bookmarkEnd w:id="41"/>
+      <w:bookmarkEnd w:id="43"/>
     </w:p>
     <w:p>
       <w:pPr>
@@ -2582,11 +2680,11 @@
       <w:pPr>
         <w:pStyle w:val="Heading2"/>
       </w:pPr>
-      <w:bookmarkStart w:name="_Toc42" w:id="42"/>
+      <w:bookmarkStart w:name="_Toc44" w:id="44"/>
       <w:r>
         <w:t xml:space="preserve">5.2. New content (a board / categories)</w:t>
       </w:r>
-      <w:bookmarkEnd w:id="42"/>
+      <w:bookmarkEnd w:id="44"/>
     </w:p>
     <w:p>
       <w:pPr>
@@ -2631,11 +2729,11 @@
       <w:pPr>
         <w:pStyle w:val="Heading2"/>
       </w:pPr>
-      <w:bookmarkStart w:name="_Toc43" w:id="43"/>
+      <w:bookmarkStart w:name="_Toc45" w:id="45"/>
       <w:r>
         <w:t xml:space="preserve">5.3. New workbook puzzle type</w:t>
       </w:r>
-      <w:bookmarkEnd w:id="43"/>
+      <w:bookmarkEnd w:id="45"/>
     </w:p>
     <w:p>
       <w:pPr>
@@ -2667,11 +2765,11 @@
       <w:pPr>
         <w:pStyle w:val="Heading2"/>
       </w:pPr>
-      <w:bookmarkStart w:name="_Toc44" w:id="44"/>
+      <w:bookmarkStart w:name="_Toc46" w:id="46"/>
       <w:r>
         <w:t xml:space="preserve">5.4. New engine mechanic</w:t>
       </w:r>
-      <w:bookmarkEnd w:id="44"/>
+      <w:bookmarkEnd w:id="46"/>
     </w:p>
     <w:p>
       <w:pPr>
@@ -2703,11 +2801,11 @@
       <w:pPr>
         <w:pStyle w:val="Heading2"/>
       </w:pPr>
-      <w:bookmarkStart w:name="_Toc45" w:id="45"/>
+      <w:bookmarkStart w:name="_Toc47" w:id="47"/>
       <w:r>
         <w:t xml:space="preserve">5.5. Code rules</w:t>
       </w:r>
-      <w:bookmarkEnd w:id="45"/>
+      <w:bookmarkEnd w:id="47"/>
     </w:p>
     <w:p>
       <w:pPr>
@@ -2757,11 +2855,11 @@
       <w:pPr>
         <w:pStyle w:val="Heading1"/>
       </w:pPr>
-      <w:bookmarkStart w:name="_Toc46" w:id="46"/>
+      <w:bookmarkStart w:name="_Toc48" w:id="48"/>
       <w:r>
         <w:t xml:space="preserve">6. Feature card template</w:t>
       </w:r>
-      <w:bookmarkEnd w:id="46"/>
+      <w:bookmarkEnd w:id="48"/>
     </w:p>
     <w:p>
       <w:pPr>
@@ -3226,11 +3324,11 @@
       <w:pPr>
         <w:pStyle w:val="Heading1"/>
       </w:pPr>
-      <w:bookmarkStart w:name="_Toc47" w:id="47"/>
+      <w:bookmarkStart w:name="_Toc49" w:id="49"/>
       <w:r>
         <w:t xml:space="preserve">7. Backlog ideas</w:t>
       </w:r>
-      <w:bookmarkEnd w:id="47"/>
+      <w:bookmarkEnd w:id="49"/>
     </w:p>
     <w:p>
       <w:pPr>
@@ -3288,11 +3386,11 @@
       <w:pPr>
         <w:pStyle w:val="Heading1"/>
       </w:pPr>
-      <w:bookmarkStart w:name="_Toc48" w:id="48"/>
+      <w:bookmarkStart w:name="_Toc50" w:id="50"/>
       <w:r>
         <w:t xml:space="preserve">8. Glossary</w:t>
       </w:r>
-      <w:bookmarkEnd w:id="48"/>
+      <w:bookmarkEnd w:id="50"/>
     </w:p>
     <w:tbl>
       <w:tblPr>
@@ -3740,6 +3838,60 @@
                 <w:bCs w:val="false"/>
               </w:rPr>
               <w:t xml:space="preserve">A workbook test on drill-list categories (podium → Practice these)</w:t>
+            </w:r>
+          </w:p>
+        </w:tc>
+      </w:tr>
+      <w:tr>
+        <w:tc>
+          <w:tcPr>
+            <w:tcW w:type="dxa" w:w="3000"/>
+            <w:tcBorders>
+              <w:top w:val="single" w:color="C9CFC9" w:sz="1"/>
+              <w:left w:val="single" w:color="C9CFC9" w:sz="1"/>
+              <w:bottom w:val="single" w:color="C9CFC9" w:sz="1"/>
+              <w:right w:val="single" w:color="C9CFC9" w:sz="1"/>
+            </w:tcBorders>
+            <w:tcMar>
+              <w:top w:type="dxa" w:w="80"/>
+              <w:left w:type="dxa" w:w="120"/>
+              <w:bottom w:type="dxa" w:w="80"/>
+              <w:right w:type="dxa" w:w="120"/>
+            </w:tcMar>
+          </w:tcPr>
+          <w:p>
+            <w:r>
+              <w:rPr>
+                <w:b w:val="false"/>
+                <w:bCs w:val="false"/>
+              </w:rPr>
+              <w:t xml:space="preserve">Daily Jeopardy</w:t>
+            </w:r>
+          </w:p>
+        </w:tc>
+        <w:tc>
+          <w:tcPr>
+            <w:tcW w:type="dxa" w:w="6026"/>
+            <w:tcBorders>
+              <w:top w:val="single" w:color="C9CFC9" w:sz="1"/>
+              <w:left w:val="single" w:color="C9CFC9" w:sz="1"/>
+              <w:bottom w:val="single" w:color="C9CFC9" w:sz="1"/>
+              <w:right w:val="single" w:color="C9CFC9" w:sz="1"/>
+            </w:tcBorders>
+            <w:tcMar>
+              <w:top w:type="dxa" w:w="80"/>
+              <w:left w:type="dxa" w:w="120"/>
+              <w:bottom w:type="dxa" w:w="80"/>
+              <w:right w:type="dxa" w:w="120"/>
+            </w:tcMar>
+          </w:tcPr>
+          <w:p>
+            <w:r>
+              <w:rPr>
+                <w:b w:val="false"/>
+                <w:bCs w:val="false"/>
+              </w:rPr>
+              <w:t xml:space="preserve">One board of the day from all pools, UTC-date seed, no final by default</w:t>
             </w:r>
           </w:p>
         </w:tc>

</xml_diff>

<commit_message>
TZ v2.3: signed release pipelines for both platforms documented
- Section 2.6: signed AAB from CI (done), .ipa pipeline ready via
  set-ios-secrets.mjs
- New 5.3 'Signing & secrets' in the developer guide (rotation, safety)
- CI/CD section and backlog updated; glossary + Play App Signing,
  provisioning profile
</commit_message>
<xml_diff>
--- a/TZ_Quizzical_Club_EN.docx
+++ b/TZ_Quizzical_Club_EN.docx
@@ -178,7 +178,7 @@
                 <w:b w:val="false"/>
                 <w:bCs w:val="false"/>
               </w:rPr>
-              <w:t xml:space="preserve">2.2 (living template)</w:t>
+              <w:t xml:space="preserve">2.3 (living template)</w:t>
             </w:r>
           </w:p>
         </w:tc>
@@ -530,32 +530,9 @@
             <w:instrText xml:space="preserve">TOC \h \o "1-2"</w:instrText>
             <w:fldChar w:fldCharType="separate"/>
           </w:r>
-          <w:hyperlink w:history="1" w:anchor="_Toc26">
+          <w:hyperlink w:history="1" w:anchor="_Toc27">
             <w:r>
               <w:t xml:space="preserve">1. Overview</w:t>
-            </w:r>
-            <w:r>
-              <w:tab/>
-            </w:r>
-            <w:r>
-              <w:fldChar w:fldCharType="begin" w:dirty="true"/>
-              <w:instrText xml:space="preserve">PAGEREF _Toc26 \h</w:instrText>
-              <w:fldChar w:fldCharType="separate"/>
-              <w:fldChar w:fldCharType="end"/>
-            </w:r>
-          </w:hyperlink>
-        </w:p>
-        <w:p>
-          <w:pPr>
-            <w:pStyle w:val="TOC2"/>
-            <w:tabs>
-              <w:tab w:val="right" w:pos="9026" w:leader="dot"/>
-            </w:tabs>
-            <w:ind w:left="220"/>
-          </w:pPr>
-          <w:hyperlink w:history="1" w:anchor="_Toc27">
-            <w:r>
-              <w:t xml:space="preserve">1.1. Goals</w:t>
             </w:r>
             <w:r>
               <w:tab/>
@@ -578,7 +555,7 @@
           </w:pPr>
           <w:hyperlink w:history="1" w:anchor="_Toc28">
             <w:r>
-              <w:t xml:space="preserve">1.2. Key facts</w:t>
+              <w:t xml:space="preserve">1.1. Goals</w:t>
             </w:r>
             <w:r>
               <w:tab/>
@@ -586,28 +563,6 @@
             <w:r>
               <w:fldChar w:fldCharType="begin" w:dirty="true"/>
               <w:instrText xml:space="preserve">PAGEREF _Toc28 \h</w:instrText>
-              <w:fldChar w:fldCharType="separate"/>
-              <w:fldChar w:fldCharType="end"/>
-            </w:r>
-          </w:hyperlink>
-        </w:p>
-        <w:p>
-          <w:pPr>
-            <w:pStyle w:val="TOC1"/>
-            <w:tabs>
-              <w:tab w:val="right" w:pos="9026" w:leader="dot"/>
-            </w:tabs>
-          </w:pPr>
-          <w:hyperlink w:history="1" w:anchor="_Toc29">
-            <w:r>
-              <w:t xml:space="preserve">2. Current functionality</w:t>
-            </w:r>
-            <w:r>
-              <w:tab/>
-            </w:r>
-            <w:r>
-              <w:fldChar w:fldCharType="begin" w:dirty="true"/>
-              <w:instrText xml:space="preserve">PAGEREF _Toc29 \h</w:instrText>
               <w:fldChar w:fldCharType="separate"/>
               <w:fldChar w:fldCharType="end"/>
             </w:r>
@@ -621,9 +576,31 @@
             </w:tabs>
             <w:ind w:left="220"/>
           </w:pPr>
+          <w:hyperlink w:history="1" w:anchor="_Toc29">
+            <w:r>
+              <w:t xml:space="preserve">1.2. Key facts</w:t>
+            </w:r>
+            <w:r>
+              <w:tab/>
+            </w:r>
+            <w:r>
+              <w:fldChar w:fldCharType="begin" w:dirty="true"/>
+              <w:instrText xml:space="preserve">PAGEREF _Toc29 \h</w:instrText>
+              <w:fldChar w:fldCharType="separate"/>
+              <w:fldChar w:fldCharType="end"/>
+            </w:r>
+          </w:hyperlink>
+        </w:p>
+        <w:p>
+          <w:pPr>
+            <w:pStyle w:val="TOC1"/>
+            <w:tabs>
+              <w:tab w:val="right" w:pos="9026" w:leader="dot"/>
+            </w:tabs>
+          </w:pPr>
           <w:hyperlink w:history="1" w:anchor="_Toc30">
             <w:r>
-              <w:t xml:space="preserve">2.1. Team Jeopardy</w:t>
+              <w:t xml:space="preserve">2. Current functionality</w:t>
             </w:r>
             <w:r>
               <w:tab/>
@@ -646,7 +623,7 @@
           </w:pPr>
           <w:hyperlink w:history="1" w:anchor="_Toc31">
             <w:r>
-              <w:t xml:space="preserve">2.2. Home &amp; Daily Jeopardy</w:t>
+              <w:t xml:space="preserve">2.1. Team Jeopardy</w:t>
             </w:r>
             <w:r>
               <w:tab/>
@@ -669,7 +646,7 @@
           </w:pPr>
           <w:hyperlink w:history="1" w:anchor="_Toc32">
             <w:r>
-              <w:t xml:space="preserve">2.3. Workbook</w:t>
+              <w:t xml:space="preserve">2.2. Home &amp; Daily Jeopardy</w:t>
             </w:r>
             <w:r>
               <w:tab/>
@@ -692,7 +669,7 @@
           </w:pPr>
           <w:hyperlink w:history="1" w:anchor="_Toc33">
             <w:r>
-              <w:t xml:space="preserve">2.4. Guides</w:t>
+              <w:t xml:space="preserve">2.3. Workbook</w:t>
             </w:r>
             <w:r>
               <w:tab/>
@@ -715,7 +692,7 @@
           </w:pPr>
           <w:hyperlink w:history="1" w:anchor="_Toc34">
             <w:r>
-              <w:t xml:space="preserve">2.5. Content &amp; games</w:t>
+              <w:t xml:space="preserve">2.4. Guides</w:t>
             </w:r>
             <w:r>
               <w:tab/>
@@ -738,7 +715,7 @@
           </w:pPr>
           <w:hyperlink w:history="1" w:anchor="_Toc35">
             <w:r>
-              <w:t xml:space="preserve">2.6. Mobile app</w:t>
+              <w:t xml:space="preserve">2.5. Content &amp; games</w:t>
             </w:r>
             <w:r>
               <w:tab/>
@@ -746,28 +723,6 @@
             <w:r>
               <w:fldChar w:fldCharType="begin" w:dirty="true"/>
               <w:instrText xml:space="preserve">PAGEREF _Toc35 \h</w:instrText>
-              <w:fldChar w:fldCharType="separate"/>
-              <w:fldChar w:fldCharType="end"/>
-            </w:r>
-          </w:hyperlink>
-        </w:p>
-        <w:p>
-          <w:pPr>
-            <w:pStyle w:val="TOC1"/>
-            <w:tabs>
-              <w:tab w:val="right" w:pos="9026" w:leader="dot"/>
-            </w:tabs>
-          </w:pPr>
-          <w:hyperlink w:history="1" w:anchor="_Toc36">
-            <w:r>
-              <w:t xml:space="preserve">3. Architecture</w:t>
-            </w:r>
-            <w:r>
-              <w:tab/>
-            </w:r>
-            <w:r>
-              <w:fldChar w:fldCharType="begin" w:dirty="true"/>
-              <w:instrText xml:space="preserve">PAGEREF _Toc36 \h</w:instrText>
               <w:fldChar w:fldCharType="separate"/>
               <w:fldChar w:fldCharType="end"/>
             </w:r>
@@ -781,9 +736,31 @@
             </w:tabs>
             <w:ind w:left="220"/>
           </w:pPr>
+          <w:hyperlink w:history="1" w:anchor="_Toc36">
+            <w:r>
+              <w:t xml:space="preserve">2.6. Mobile app</w:t>
+            </w:r>
+            <w:r>
+              <w:tab/>
+            </w:r>
+            <w:r>
+              <w:fldChar w:fldCharType="begin" w:dirty="true"/>
+              <w:instrText xml:space="preserve">PAGEREF _Toc36 \h</w:instrText>
+              <w:fldChar w:fldCharType="separate"/>
+              <w:fldChar w:fldCharType="end"/>
+            </w:r>
+          </w:hyperlink>
+        </w:p>
+        <w:p>
+          <w:pPr>
+            <w:pStyle w:val="TOC1"/>
+            <w:tabs>
+              <w:tab w:val="right" w:pos="9026" w:leader="dot"/>
+            </w:tabs>
+          </w:pPr>
           <w:hyperlink w:history="1" w:anchor="_Toc37">
             <w:r>
-              <w:t xml:space="preserve">3.1. Principles</w:t>
+              <w:t xml:space="preserve">3. Architecture</w:t>
             </w:r>
             <w:r>
               <w:tab/>
@@ -806,7 +783,7 @@
           </w:pPr>
           <w:hyperlink w:history="1" w:anchor="_Toc38">
             <w:r>
-              <w:t xml:space="preserve">3.2. Repository layout</w:t>
+              <w:t xml:space="preserve">3.1. Principles</w:t>
             </w:r>
             <w:r>
               <w:tab/>
@@ -829,7 +806,7 @@
           </w:pPr>
           <w:hyperlink w:history="1" w:anchor="_Toc39">
             <w:r>
-              <w:t xml:space="preserve">3.3. Team game lifecycle</w:t>
+              <w:t xml:space="preserve">3.2. Repository layout</w:t>
             </w:r>
             <w:r>
               <w:tab/>
@@ -837,28 +814,6 @@
             <w:r>
               <w:fldChar w:fldCharType="begin" w:dirty="true"/>
               <w:instrText xml:space="preserve">PAGEREF _Toc39 \h</w:instrText>
-              <w:fldChar w:fldCharType="separate"/>
-              <w:fldChar w:fldCharType="end"/>
-            </w:r>
-          </w:hyperlink>
-        </w:p>
-        <w:p>
-          <w:pPr>
-            <w:pStyle w:val="TOC1"/>
-            <w:tabs>
-              <w:tab w:val="right" w:pos="9026" w:leader="dot"/>
-            </w:tabs>
-          </w:pPr>
-          <w:hyperlink w:history="1" w:anchor="_Toc40">
-            <w:r>
-              <w:t xml:space="preserve">4. Testing &amp; quality</w:t>
-            </w:r>
-            <w:r>
-              <w:tab/>
-            </w:r>
-            <w:r>
-              <w:fldChar w:fldCharType="begin" w:dirty="true"/>
-              <w:instrText xml:space="preserve">PAGEREF _Toc40 \h</w:instrText>
               <w:fldChar w:fldCharType="separate"/>
               <w:fldChar w:fldCharType="end"/>
             </w:r>
@@ -872,16 +827,16 @@
             </w:tabs>
             <w:ind w:left="220"/>
           </w:pPr>
-          <w:hyperlink w:history="1" w:anchor="_Toc41">
-            <w:r>
-              <w:t xml:space="preserve">4.1. CI/CD</w:t>
+          <w:hyperlink w:history="1" w:anchor="_Toc40">
+            <w:r>
+              <w:t xml:space="preserve">3.3. Team game lifecycle</w:t>
             </w:r>
             <w:r>
               <w:tab/>
             </w:r>
             <w:r>
               <w:fldChar w:fldCharType="begin" w:dirty="true"/>
-              <w:instrText xml:space="preserve">PAGEREF _Toc41 \h</w:instrText>
+              <w:instrText xml:space="preserve">PAGEREF _Toc40 \h</w:instrText>
               <w:fldChar w:fldCharType="separate"/>
               <w:fldChar w:fldCharType="end"/>
             </w:r>
@@ -894,16 +849,16 @@
               <w:tab w:val="right" w:pos="9026" w:leader="dot"/>
             </w:tabs>
           </w:pPr>
-          <w:hyperlink w:history="1" w:anchor="_Toc42">
-            <w:r>
-              <w:t xml:space="preserve">5. How to add features</w:t>
+          <w:hyperlink w:history="1" w:anchor="_Toc41">
+            <w:r>
+              <w:t xml:space="preserve">4. Testing &amp; quality</w:t>
             </w:r>
             <w:r>
               <w:tab/>
             </w:r>
             <w:r>
               <w:fldChar w:fldCharType="begin" w:dirty="true"/>
-              <w:instrText xml:space="preserve">PAGEREF _Toc42 \h</w:instrText>
+              <w:instrText xml:space="preserve">PAGEREF _Toc41 \h</w:instrText>
               <w:fldChar w:fldCharType="separate"/>
               <w:fldChar w:fldCharType="end"/>
             </w:r>
@@ -917,9 +872,31 @@
             </w:tabs>
             <w:ind w:left="220"/>
           </w:pPr>
+          <w:hyperlink w:history="1" w:anchor="_Toc42">
+            <w:r>
+              <w:t xml:space="preserve">4.1. CI/CD</w:t>
+            </w:r>
+            <w:r>
+              <w:tab/>
+            </w:r>
+            <w:r>
+              <w:fldChar w:fldCharType="begin" w:dirty="true"/>
+              <w:instrText xml:space="preserve">PAGEREF _Toc42 \h</w:instrText>
+              <w:fldChar w:fldCharType="separate"/>
+              <w:fldChar w:fldCharType="end"/>
+            </w:r>
+          </w:hyperlink>
+        </w:p>
+        <w:p>
+          <w:pPr>
+            <w:pStyle w:val="TOC1"/>
+            <w:tabs>
+              <w:tab w:val="right" w:pos="9026" w:leader="dot"/>
+            </w:tabs>
+          </w:pPr>
           <w:hyperlink w:history="1" w:anchor="_Toc43">
             <w:r>
-              <w:t xml:space="preserve">5.1. New game from existing boards</w:t>
+              <w:t xml:space="preserve">5. How to add features</w:t>
             </w:r>
             <w:r>
               <w:tab/>
@@ -942,7 +919,7 @@
           </w:pPr>
           <w:hyperlink w:history="1" w:anchor="_Toc44">
             <w:r>
-              <w:t xml:space="preserve">5.2. New content (a board / categories)</w:t>
+              <w:t xml:space="preserve">5.1. New game from existing boards</w:t>
             </w:r>
             <w:r>
               <w:tab/>
@@ -965,7 +942,7 @@
           </w:pPr>
           <w:hyperlink w:history="1" w:anchor="_Toc45">
             <w:r>
-              <w:t xml:space="preserve">5.3. New workbook puzzle type</w:t>
+              <w:t xml:space="preserve">5.2. New content (a board / categories)</w:t>
             </w:r>
             <w:r>
               <w:tab/>
@@ -988,7 +965,7 @@
           </w:pPr>
           <w:hyperlink w:history="1" w:anchor="_Toc46">
             <w:r>
-              <w:t xml:space="preserve">5.4. New engine mechanic</w:t>
+              <w:t xml:space="preserve">5.3. Signing &amp; secrets</w:t>
             </w:r>
             <w:r>
               <w:tab/>
@@ -1011,7 +988,7 @@
           </w:pPr>
           <w:hyperlink w:history="1" w:anchor="_Toc47">
             <w:r>
-              <w:t xml:space="preserve">5.5. Code rules</w:t>
+              <w:t xml:space="preserve">5.4. New workbook puzzle type</w:t>
             </w:r>
             <w:r>
               <w:tab/>
@@ -1026,14 +1003,15 @@
         </w:p>
         <w:p>
           <w:pPr>
-            <w:pStyle w:val="TOC1"/>
+            <w:pStyle w:val="TOC2"/>
             <w:tabs>
               <w:tab w:val="right" w:pos="9026" w:leader="dot"/>
             </w:tabs>
+            <w:ind w:left="220"/>
           </w:pPr>
           <w:hyperlink w:history="1" w:anchor="_Toc48">
             <w:r>
-              <w:t xml:space="preserve">6. Feature card template</w:t>
+              <w:t xml:space="preserve">5.5. New engine mechanic</w:t>
             </w:r>
             <w:r>
               <w:tab/>
@@ -1048,14 +1026,15 @@
         </w:p>
         <w:p>
           <w:pPr>
-            <w:pStyle w:val="TOC1"/>
+            <w:pStyle w:val="TOC2"/>
             <w:tabs>
               <w:tab w:val="right" w:pos="9026" w:leader="dot"/>
             </w:tabs>
+            <w:ind w:left="220"/>
           </w:pPr>
           <w:hyperlink w:history="1" w:anchor="_Toc49">
             <w:r>
-              <w:t xml:space="preserve">7. Backlog ideas</w:t>
+              <w:t xml:space="preserve">5.6. Code rules</w:t>
             </w:r>
             <w:r>
               <w:tab/>
@@ -1077,7 +1056,7 @@
           </w:pPr>
           <w:hyperlink w:history="1" w:anchor="_Toc50">
             <w:r>
-              <w:t xml:space="preserve">8. Glossary</w:t>
+              <w:t xml:space="preserve">6. Feature card template</w:t>
             </w:r>
             <w:r>
               <w:tab/>
@@ -1085,6 +1064,50 @@
             <w:r>
               <w:fldChar w:fldCharType="begin" w:dirty="true"/>
               <w:instrText xml:space="preserve">PAGEREF _Toc50 \h</w:instrText>
+              <w:fldChar w:fldCharType="separate"/>
+              <w:fldChar w:fldCharType="end"/>
+            </w:r>
+          </w:hyperlink>
+        </w:p>
+        <w:p>
+          <w:pPr>
+            <w:pStyle w:val="TOC1"/>
+            <w:tabs>
+              <w:tab w:val="right" w:pos="9026" w:leader="dot"/>
+            </w:tabs>
+          </w:pPr>
+          <w:hyperlink w:history="1" w:anchor="_Toc51">
+            <w:r>
+              <w:t xml:space="preserve">7. Backlog ideas</w:t>
+            </w:r>
+            <w:r>
+              <w:tab/>
+            </w:r>
+            <w:r>
+              <w:fldChar w:fldCharType="begin" w:dirty="true"/>
+              <w:instrText xml:space="preserve">PAGEREF _Toc51 \h</w:instrText>
+              <w:fldChar w:fldCharType="separate"/>
+              <w:fldChar w:fldCharType="end"/>
+            </w:r>
+          </w:hyperlink>
+        </w:p>
+        <w:p>
+          <w:pPr>
+            <w:pStyle w:val="TOC1"/>
+            <w:tabs>
+              <w:tab w:val="right" w:pos="9026" w:leader="dot"/>
+            </w:tabs>
+          </w:pPr>
+          <w:hyperlink w:history="1" w:anchor="_Toc52">
+            <w:r>
+              <w:t xml:space="preserve">8. Glossary</w:t>
+            </w:r>
+            <w:r>
+              <w:tab/>
+            </w:r>
+            <w:r>
+              <w:fldChar w:fldCharType="begin" w:dirty="true"/>
+              <w:instrText xml:space="preserve">PAGEREF _Toc52 \h</w:instrText>
               <w:fldChar w:fldCharType="separate"/>
               <w:fldChar w:fldCharType="end"/>
             </w:r>
@@ -1106,11 +1129,11 @@
       <w:pPr>
         <w:pStyle w:val="Heading1"/>
       </w:pPr>
-      <w:bookmarkStart w:name="_Toc26" w:id="26"/>
+      <w:bookmarkStart w:name="_Toc27" w:id="27"/>
       <w:r>
         <w:t xml:space="preserve">1. Overview</w:t>
       </w:r>
-      <w:bookmarkEnd w:id="26"/>
+      <w:bookmarkEnd w:id="27"/>
     </w:p>
     <w:p>
       <w:pPr>
@@ -1132,11 +1155,11 @@
       <w:pPr>
         <w:pStyle w:val="Heading2"/>
       </w:pPr>
-      <w:bookmarkStart w:name="_Toc27" w:id="27"/>
+      <w:bookmarkStart w:name="_Toc28" w:id="28"/>
       <w:r>
         <w:t xml:space="preserve">1.1. Goals</w:t>
       </w:r>
-      <w:bookmarkEnd w:id="27"/>
+      <w:bookmarkEnd w:id="28"/>
     </w:p>
     <w:p>
       <w:pPr>
@@ -1220,11 +1243,11 @@
       <w:pPr>
         <w:pStyle w:val="Heading2"/>
       </w:pPr>
-      <w:bookmarkStart w:name="_Toc28" w:id="28"/>
+      <w:bookmarkStart w:name="_Toc29" w:id="29"/>
       <w:r>
         <w:t xml:space="preserve">1.2. Key facts</w:t>
       </w:r>
-      <w:bookmarkEnd w:id="28"/>
+      <w:bookmarkEnd w:id="29"/>
     </w:p>
     <w:tbl>
       <w:tblPr>
@@ -1563,7 +1586,7 @@
                 <w:b w:val="false"/>
                 <w:bCs w:val="false"/>
               </w:rPr>
-              <w:t xml:space="preserve">Pages deploy with e2e gate · Android APK+AAB · iOS build check (macOS)</w:t>
+              <w:t xml:space="preserve">Pages deploy with e2e gate · Android: signed AAB · iOS: .ipa when secrets are set</w:t>
             </w:r>
           </w:p>
         </w:tc>
@@ -1578,21 +1601,21 @@
       <w:pPr>
         <w:pStyle w:val="Heading1"/>
       </w:pPr>
-      <w:bookmarkStart w:name="_Toc29" w:id="29"/>
+      <w:bookmarkStart w:name="_Toc30" w:id="30"/>
       <w:r>
         <w:t xml:space="preserve">2. Current functionality</w:t>
       </w:r>
-      <w:bookmarkEnd w:id="29"/>
+      <w:bookmarkEnd w:id="30"/>
     </w:p>
     <w:p>
       <w:pPr>
         <w:pStyle w:val="Heading2"/>
       </w:pPr>
-      <w:bookmarkStart w:name="_Toc30" w:id="30"/>
+      <w:bookmarkStart w:name="_Toc31" w:id="31"/>
       <w:r>
         <w:t xml:space="preserve">2.1. Team Jeopardy</w:t>
       </w:r>
-      <w:bookmarkEnd w:id="30"/>
+      <w:bookmarkEnd w:id="31"/>
     </w:p>
     <w:p>
       <w:pPr>
@@ -1715,11 +1738,11 @@
       <w:pPr>
         <w:pStyle w:val="Heading2"/>
       </w:pPr>
-      <w:bookmarkStart w:name="_Toc31" w:id="31"/>
+      <w:bookmarkStart w:name="_Toc32" w:id="32"/>
       <w:r>
         <w:t xml:space="preserve">2.2. Home &amp; Daily Jeopardy</w:t>
       </w:r>
-      <w:bookmarkEnd w:id="31"/>
+      <w:bookmarkEnd w:id="32"/>
     </w:p>
     <w:p>
       <w:pPr>
@@ -1751,11 +1774,11 @@
       <w:pPr>
         <w:pStyle w:val="Heading2"/>
       </w:pPr>
-      <w:bookmarkStart w:name="_Toc32" w:id="32"/>
+      <w:bookmarkStart w:name="_Toc33" w:id="33"/>
       <w:r>
         <w:t xml:space="preserve">2.3. Workbook</w:t>
       </w:r>
-      <w:bookmarkEnd w:id="32"/>
+      <w:bookmarkEnd w:id="33"/>
     </w:p>
     <w:p>
       <w:pPr>
@@ -1826,11 +1849,11 @@
       <w:pPr>
         <w:pStyle w:val="Heading2"/>
       </w:pPr>
-      <w:bookmarkStart w:name="_Toc33" w:id="33"/>
+      <w:bookmarkStart w:name="_Toc34" w:id="34"/>
       <w:r>
         <w:t xml:space="preserve">2.4. Guides</w:t>
       </w:r>
-      <w:bookmarkEnd w:id="33"/>
+      <w:bookmarkEnd w:id="34"/>
     </w:p>
     <w:p>
       <w:pPr>
@@ -1849,11 +1872,11 @@
       <w:pPr>
         <w:pStyle w:val="Heading2"/>
       </w:pPr>
-      <w:bookmarkStart w:name="_Toc34" w:id="34"/>
+      <w:bookmarkStart w:name="_Toc35" w:id="35"/>
       <w:r>
         <w:t xml:space="preserve">2.5. Content &amp; games</w:t>
       </w:r>
-      <w:bookmarkEnd w:id="34"/>
+      <w:bookmarkEnd w:id="35"/>
     </w:p>
     <w:tbl>
       <w:tblPr>
@@ -2216,11 +2239,11 @@
       <w:pPr>
         <w:pStyle w:val="Heading2"/>
       </w:pPr>
-      <w:bookmarkStart w:name="_Toc35" w:id="35"/>
+      <w:bookmarkStart w:name="_Toc36" w:id="36"/>
       <w:r>
         <w:t xml:space="preserve">2.6. Mobile app</w:t>
       </w:r>
-      <w:bookmarkEnd w:id="35"/>
+      <w:bookmarkEnd w:id="36"/>
     </w:p>
     <w:p>
       <w:pPr>
@@ -2258,7 +2281,7 @@
         <w:spacing w:after="60"/>
       </w:pPr>
       <w:r>
-        <w:t xml:space="preserve">CI: android.yml builds debug APK + release AAB artifacts; ios.yml verifies the build compiles on macOS (unsigned).</w:t>
+        <w:t xml:space="preserve">CI: android.yml builds a debug APK and a SIGNED release AAB (keystore from Secrets, jarsigner-verified); ios.yml produces a signed App Store .ipa once the Apple secrets are uploaded (set-ios-secrets.mjs).</w:t>
       </w:r>
     </w:p>
     <w:p>
@@ -2271,7 +2294,7 @@
         <w:spacing w:after="60"/>
       </w:pPr>
       <w:r>
-        <w:t xml:space="preserve">Store &amp; monetization guide: docs/STORE_GUIDE.md (signing, Data safety = no data collected, ratings, pricing options).</w:t>
+        <w:t xml:space="preserve">No-Mac signing: Android keystore already in Secrets; for iOS — dist.p12 + provisioning profile via tools/docgen/set-ios-secrets.mjs (guide in docs/STORE_GUIDE.md). Data safety: no data collected.</w:t>
       </w:r>
     </w:p>
     <w:p>
@@ -2283,21 +2306,21 @@
       <w:pPr>
         <w:pStyle w:val="Heading1"/>
       </w:pPr>
-      <w:bookmarkStart w:name="_Toc36" w:id="36"/>
+      <w:bookmarkStart w:name="_Toc37" w:id="37"/>
       <w:r>
         <w:t xml:space="preserve">3. Architecture</w:t>
       </w:r>
-      <w:bookmarkEnd w:id="36"/>
+      <w:bookmarkEnd w:id="37"/>
     </w:p>
     <w:p>
       <w:pPr>
         <w:pStyle w:val="Heading2"/>
       </w:pPr>
-      <w:bookmarkStart w:name="_Toc37" w:id="37"/>
+      <w:bookmarkStart w:name="_Toc38" w:id="38"/>
       <w:r>
         <w:t xml:space="preserve">3.1. Principles</w:t>
       </w:r>
-      <w:bookmarkEnd w:id="37"/>
+      <w:bookmarkEnd w:id="38"/>
     </w:p>
     <w:p>
       <w:pPr>
@@ -2355,11 +2378,11 @@
       <w:pPr>
         <w:pStyle w:val="Heading2"/>
       </w:pPr>
-      <w:bookmarkStart w:name="_Toc38" w:id="38"/>
+      <w:bookmarkStart w:name="_Toc39" w:id="39"/>
       <w:r>
         <w:t xml:space="preserve">3.2. Repository layout</w:t>
       </w:r>
-      <w:bookmarkEnd w:id="38"/>
+      <w:bookmarkEnd w:id="39"/>
     </w:p>
     <w:p>
       <w:pPr>
@@ -2485,11 +2508,11 @@
       <w:pPr>
         <w:pStyle w:val="Heading2"/>
       </w:pPr>
-      <w:bookmarkStart w:name="_Toc39" w:id="39"/>
+      <w:bookmarkStart w:name="_Toc40" w:id="40"/>
       <w:r>
         <w:t xml:space="preserve">3.3. Team game lifecycle</w:t>
       </w:r>
-      <w:bookmarkEnd w:id="39"/>
+      <w:bookmarkEnd w:id="40"/>
     </w:p>
     <w:p>
       <w:pPr>
@@ -2534,11 +2557,11 @@
       <w:pPr>
         <w:pStyle w:val="Heading1"/>
       </w:pPr>
-      <w:bookmarkStart w:name="_Toc40" w:id="40"/>
+      <w:bookmarkStart w:name="_Toc41" w:id="41"/>
       <w:r>
         <w:t xml:space="preserve">4. Testing &amp; quality</w:t>
       </w:r>
-      <w:bookmarkEnd w:id="40"/>
+      <w:bookmarkEnd w:id="41"/>
     </w:p>
     <w:p>
       <w:pPr>
@@ -2583,18 +2606,18 @@
       <w:pPr>
         <w:pStyle w:val="Heading2"/>
       </w:pPr>
-      <w:bookmarkStart w:name="_Toc41" w:id="41"/>
+      <w:bookmarkStart w:name="_Toc42" w:id="42"/>
       <w:r>
         <w:t xml:space="preserve">4.1. CI/CD</w:t>
       </w:r>
-      <w:bookmarkEnd w:id="41"/>
+      <w:bookmarkEnd w:id="42"/>
     </w:p>
     <w:p>
       <w:pPr>
         <w:spacing w:after="120"/>
       </w:pPr>
       <w:r>
-        <w:t xml:space="preserve">Push to main: npm ci → tsc → vitest → playwright (desktop gate) → vite build → deploy-pages. Separately: android.yml (APK+AAB artifacts) and ios.yml (macOS build check). Rule or content regressions block deploys.</w:t>
+        <w:t xml:space="preserve">Push to main: npm ci → tsc → vitest → playwright (desktop gate) → vite build → deploy-pages. Separately: android.yml (debug APK + signed release AAB from Secrets, signature verified) and ios.yml (compile always; signed .ipa once Apple secrets exist). Rule or content regressions block deploys.</w:t>
       </w:r>
     </w:p>
     <w:p>
@@ -2621,21 +2644,21 @@
       <w:pPr>
         <w:pStyle w:val="Heading1"/>
       </w:pPr>
-      <w:bookmarkStart w:name="_Toc42" w:id="42"/>
+      <w:bookmarkStart w:name="_Toc43" w:id="43"/>
       <w:r>
         <w:t xml:space="preserve">5. How to add features</w:t>
       </w:r>
-      <w:bookmarkEnd w:id="42"/>
+      <w:bookmarkEnd w:id="43"/>
     </w:p>
     <w:p>
       <w:pPr>
         <w:pStyle w:val="Heading2"/>
       </w:pPr>
-      <w:bookmarkStart w:name="_Toc43" w:id="43"/>
+      <w:bookmarkStart w:name="_Toc44" w:id="44"/>
       <w:r>
         <w:t xml:space="preserve">5.1. New game from existing boards</w:t>
       </w:r>
-      <w:bookmarkEnd w:id="43"/>
+      <w:bookmarkEnd w:id="44"/>
     </w:p>
     <w:p>
       <w:pPr>
@@ -2680,11 +2703,11 @@
       <w:pPr>
         <w:pStyle w:val="Heading2"/>
       </w:pPr>
-      <w:bookmarkStart w:name="_Toc44" w:id="44"/>
+      <w:bookmarkStart w:name="_Toc45" w:id="45"/>
       <w:r>
         <w:t xml:space="preserve">5.2. New content (a board / categories)</w:t>
       </w:r>
-      <w:bookmarkEnd w:id="44"/>
+      <w:bookmarkEnd w:id="45"/>
     </w:p>
     <w:p>
       <w:pPr>
@@ -2729,11 +2752,11 @@
       <w:pPr>
         <w:pStyle w:val="Heading2"/>
       </w:pPr>
-      <w:bookmarkStart w:name="_Toc45" w:id="45"/>
-      <w:r>
-        <w:t xml:space="preserve">5.3. New workbook puzzle type</w:t>
-      </w:r>
-      <w:bookmarkEnd w:id="45"/>
+      <w:bookmarkStart w:name="_Toc46" w:id="46"/>
+      <w:r>
+        <w:t xml:space="preserve">5.3. Signing &amp; secrets</w:t>
+      </w:r>
+      <w:bookmarkEnd w:id="46"/>
     </w:p>
     <w:p>
       <w:pPr>
@@ -2745,6 +2768,55 @@
         <w:spacing w:after="60"/>
       </w:pPr>
       <w:r>
+        <w:t xml:space="preserve">Android: keystore and passwords live in Secrets (KEYSTORE_*); rotate by re-running set-secrets.mjs, local copy in signing-local/ (gitignored).</w:t>
+      </w:r>
+    </w:p>
+    <w:p>
+      <w:pPr>
+        <w:pStyle w:val="ListParagraph"/>
+        <w:numPr>
+          <w:ilvl w:val="0"/>
+          <w:numId w:val="3"/>
+        </w:numPr>
+        <w:spacing w:after="60"/>
+      </w:pPr>
+      <w:r>
+        <w:t xml:space="preserve">iOS: dist.p12 + app.mobileprovision + Team ID in signing-local/apple/ → node tools/docgen/set-ios-secrets.mjs → IOS_SIGNING_READY enables the signing steps.</w:t>
+      </w:r>
+    </w:p>
+    <w:p>
+      <w:pPr>
+        <w:pStyle w:val="ListParagraph"/>
+        <w:numPr>
+          <w:ilvl w:val="0"/>
+          <w:numId w:val="3"/>
+        </w:numPr>
+        <w:spacing w:after="60"/>
+      </w:pPr>
+      <w:r>
+        <w:t xml:space="preserve">NEVER commit keys or passwords; signing-local/ and *.keystore are gitignored.</w:t>
+      </w:r>
+    </w:p>
+    <w:p>
+      <w:pPr>
+        <w:pStyle w:val="Heading2"/>
+      </w:pPr>
+      <w:bookmarkStart w:name="_Toc47" w:id="47"/>
+      <w:r>
+        <w:t xml:space="preserve">5.4. New workbook puzzle type</w:t>
+      </w:r>
+      <w:bookmarkEnd w:id="47"/>
+    </w:p>
+    <w:p>
+      <w:pPr>
+        <w:pStyle w:val="ListParagraph"/>
+        <w:numPr>
+          <w:ilvl w:val="0"/>
+          <w:numId w:val="3"/>
+        </w:numPr>
+        <w:spacing w:after="60"/>
+      </w:pPr>
+      <w:r>
         <w:t xml:space="preserve">TaskType + TASK_TYPE_LABELS (categoryTypes.ts), tag CATEGORY_TYPES; add a guide in guides.ts with the same type.</w:t>
       </w:r>
     </w:p>
@@ -2765,11 +2837,11 @@
       <w:pPr>
         <w:pStyle w:val="Heading2"/>
       </w:pPr>
-      <w:bookmarkStart w:name="_Toc46" w:id="46"/>
-      <w:r>
-        <w:t xml:space="preserve">5.4. New engine mechanic</w:t>
-      </w:r>
-      <w:bookmarkEnd w:id="46"/>
+      <w:bookmarkStart w:name="_Toc48" w:id="48"/>
+      <w:r>
+        <w:t xml:space="preserve">5.5. New engine mechanic</w:t>
+      </w:r>
+      <w:bookmarkEnd w:id="48"/>
     </w:p>
     <w:p>
       <w:pPr>
@@ -2801,11 +2873,11 @@
       <w:pPr>
         <w:pStyle w:val="Heading2"/>
       </w:pPr>
-      <w:bookmarkStart w:name="_Toc47" w:id="47"/>
-      <w:r>
-        <w:t xml:space="preserve">5.5. Code rules</w:t>
-      </w:r>
-      <w:bookmarkEnd w:id="47"/>
+      <w:bookmarkStart w:name="_Toc49" w:id="49"/>
+      <w:r>
+        <w:t xml:space="preserve">5.6. Code rules</w:t>
+      </w:r>
+      <w:bookmarkEnd w:id="49"/>
     </w:p>
     <w:p>
       <w:pPr>
@@ -2855,11 +2927,11 @@
       <w:pPr>
         <w:pStyle w:val="Heading1"/>
       </w:pPr>
-      <w:bookmarkStart w:name="_Toc48" w:id="48"/>
+      <w:bookmarkStart w:name="_Toc50" w:id="50"/>
       <w:r>
         <w:t xml:space="preserve">6. Feature card template</w:t>
       </w:r>
-      <w:bookmarkEnd w:id="48"/>
+      <w:bookmarkEnd w:id="50"/>
     </w:p>
     <w:p>
       <w:pPr>
@@ -3324,11 +3396,11 @@
       <w:pPr>
         <w:pStyle w:val="Heading1"/>
       </w:pPr>
-      <w:bookmarkStart w:name="_Toc49" w:id="49"/>
+      <w:bookmarkStart w:name="_Toc51" w:id="51"/>
       <w:r>
         <w:t xml:space="preserve">7. Backlog ideas</w:t>
       </w:r>
-      <w:bookmarkEnd w:id="49"/>
+      <w:bookmarkEnd w:id="51"/>
     </w:p>
     <w:p>
       <w:pPr>
@@ -3340,7 +3412,7 @@
         <w:spacing w:after="60"/>
       </w:pPr>
       <w:r>
-        <w:t xml:space="preserve">Signed release AAB via repository secrets; TestFlight archive for iOS from CI.</w:t>
+        <w:t xml:space="preserve">Upload the Apple certificates to Secrets (see the guide) → signed .ipa from CI → TestFlight.</w:t>
       </w:r>
     </w:p>
     <w:p>
@@ -3386,11 +3458,11 @@
       <w:pPr>
         <w:pStyle w:val="Heading1"/>
       </w:pPr>
-      <w:bookmarkStart w:name="_Toc50" w:id="50"/>
+      <w:bookmarkStart w:name="_Toc52" w:id="52"/>
       <w:r>
         <w:t xml:space="preserve">8. Glossary</w:t>
       </w:r>
-      <w:bookmarkEnd w:id="50"/>
+      <w:bookmarkEnd w:id="52"/>
     </w:p>
     <w:tbl>
       <w:tblPr>
@@ -3892,6 +3964,114 @@
                 <w:bCs w:val="false"/>
               </w:rPr>
               <w:t xml:space="preserve">One board of the day from all pools, UTC-date seed, no final by default</w:t>
+            </w:r>
+          </w:p>
+        </w:tc>
+      </w:tr>
+      <w:tr>
+        <w:tc>
+          <w:tcPr>
+            <w:tcW w:type="dxa" w:w="3000"/>
+            <w:tcBorders>
+              <w:top w:val="single" w:color="C9CFC9" w:sz="1"/>
+              <w:left w:val="single" w:color="C9CFC9" w:sz="1"/>
+              <w:bottom w:val="single" w:color="C9CFC9" w:sz="1"/>
+              <w:right w:val="single" w:color="C9CFC9" w:sz="1"/>
+            </w:tcBorders>
+            <w:tcMar>
+              <w:top w:type="dxa" w:w="80"/>
+              <w:left w:type="dxa" w:w="120"/>
+              <w:bottom w:type="dxa" w:w="80"/>
+              <w:right w:type="dxa" w:w="120"/>
+            </w:tcMar>
+          </w:tcPr>
+          <w:p>
+            <w:r>
+              <w:rPr>
+                <w:b w:val="false"/>
+                <w:bCs w:val="false"/>
+              </w:rPr>
+              <w:t xml:space="preserve">Play App Signing</w:t>
+            </w:r>
+          </w:p>
+        </w:tc>
+        <w:tc>
+          <w:tcPr>
+            <w:tcW w:type="dxa" w:w="6026"/>
+            <w:tcBorders>
+              <w:top w:val="single" w:color="C9CFC9" w:sz="1"/>
+              <w:left w:val="single" w:color="C9CFC9" w:sz="1"/>
+              <w:bottom w:val="single" w:color="C9CFC9" w:sz="1"/>
+              <w:right w:val="single" w:color="C9CFC9" w:sz="1"/>
+            </w:tcBorders>
+            <w:tcMar>
+              <w:top w:type="dxa" w:w="80"/>
+              <w:left w:type="dxa" w:w="120"/>
+              <w:bottom w:type="dxa" w:w="80"/>
+              <w:right w:type="dxa" w:w="120"/>
+            </w:tcMar>
+          </w:tcPr>
+          <w:p>
+            <w:r>
+              <w:rPr>
+                <w:b w:val="false"/>
+                <w:bCs w:val="false"/>
+              </w:rPr>
+              <w:t xml:space="preserve">Google holds the app key; the CI upload key only signs uploads</w:t>
+            </w:r>
+          </w:p>
+        </w:tc>
+      </w:tr>
+      <w:tr>
+        <w:tc>
+          <w:tcPr>
+            <w:tcW w:type="dxa" w:w="3000"/>
+            <w:tcBorders>
+              <w:top w:val="single" w:color="C9CFC9" w:sz="1"/>
+              <w:left w:val="single" w:color="C9CFC9" w:sz="1"/>
+              <w:bottom w:val="single" w:color="C9CFC9" w:sz="1"/>
+              <w:right w:val="single" w:color="C9CFC9" w:sz="1"/>
+            </w:tcBorders>
+            <w:tcMar>
+              <w:top w:type="dxa" w:w="80"/>
+              <w:left w:type="dxa" w:w="120"/>
+              <w:bottom w:type="dxa" w:w="80"/>
+              <w:right w:type="dxa" w:w="120"/>
+            </w:tcMar>
+          </w:tcPr>
+          <w:p>
+            <w:r>
+              <w:rPr>
+                <w:b w:val="false"/>
+                <w:bCs w:val="false"/>
+              </w:rPr>
+              <w:t xml:space="preserve">Provisioning profile</w:t>
+            </w:r>
+          </w:p>
+        </w:tc>
+        <w:tc>
+          <w:tcPr>
+            <w:tcW w:type="dxa" w:w="6026"/>
+            <w:tcBorders>
+              <w:top w:val="single" w:color="C9CFC9" w:sz="1"/>
+              <w:left w:val="single" w:color="C9CFC9" w:sz="1"/>
+              <w:bottom w:val="single" w:color="C9CFC9" w:sz="1"/>
+              <w:right w:val="single" w:color="C9CFC9" w:sz="1"/>
+            </w:tcBorders>
+            <w:tcMar>
+              <w:top w:type="dxa" w:w="80"/>
+              <w:left w:type="dxa" w:w="120"/>
+              <w:bottom w:type="dxa" w:w="80"/>
+              <w:right w:type="dxa" w:w="120"/>
+            </w:tcMar>
+          </w:tcPr>
+          <w:p>
+            <w:r>
+              <w:rPr>
+                <w:b w:val="false"/>
+                <w:bCs w:val="false"/>
+              </w:rPr>
+              <w:t xml:space="preserve">Apple's authorization to install/publish an app for a bundle id</w:t>
             </w:r>
           </w:p>
         </w:tc>

</xml_diff>

<commit_message>
Printable host packs: 29 PDFs in docs/print/ + TZ v2.4
- dump-boards.mjs (jiti): every playable part's boards with values,
  clues, answers and host notes → boards.json
- print_cards.py (reportlab): cover with offline rules, strike-off board
  grid per round, host clue pages (value + clue + answer + note)
- TZ v2.4 documents the packs; backlog item closed
</commit_message>
<xml_diff>
--- a/TZ_Quizzical_Club_EN.docx
+++ b/TZ_Quizzical_Club_EN.docx
@@ -178,7 +178,7 @@
                 <w:b w:val="false"/>
                 <w:bCs w:val="false"/>
               </w:rPr>
-              <w:t xml:space="preserve">2.3 (living template)</w:t>
+              <w:t xml:space="preserve">2.4 (living template)</w:t>
             </w:r>
           </w:p>
         </w:tc>
@@ -1506,6 +1506,60 @@
                 <w:b w:val="false"/>
                 <w:bCs w:val="false"/>
               </w:rPr>
+              <w:t xml:space="preserve">Printable packs</w:t>
+            </w:r>
+          </w:p>
+        </w:tc>
+        <w:tc>
+          <w:tcPr>
+            <w:tcW w:type="dxa" w:w="5626"/>
+            <w:tcBorders>
+              <w:top w:val="single" w:color="C9CFC9" w:sz="1"/>
+              <w:left w:val="single" w:color="C9CFC9" w:sz="1"/>
+              <w:bottom w:val="single" w:color="C9CFC9" w:sz="1"/>
+              <w:right w:val="single" w:color="C9CFC9" w:sz="1"/>
+            </w:tcBorders>
+            <w:tcMar>
+              <w:top w:type="dxa" w:w="80"/>
+              <w:left w:type="dxa" w:w="120"/>
+              <w:bottom w:type="dxa" w:w="80"/>
+              <w:right w:type="dxa" w:w="120"/>
+            </w:tcMar>
+          </w:tcPr>
+          <w:p>
+            <w:r>
+              <w:rPr>
+                <w:b w:val="false"/>
+                <w:bCs w:val="false"/>
+              </w:rPr>
+              <w:t xml:space="preserve">29 PDFs in docs/print/ (one per part)</w:t>
+            </w:r>
+          </w:p>
+        </w:tc>
+      </w:tr>
+      <w:tr>
+        <w:tc>
+          <w:tcPr>
+            <w:tcW w:type="dxa" w:w="3400"/>
+            <w:tcBorders>
+              <w:top w:val="single" w:color="C9CFC9" w:sz="1"/>
+              <w:left w:val="single" w:color="C9CFC9" w:sz="1"/>
+              <w:bottom w:val="single" w:color="C9CFC9" w:sz="1"/>
+              <w:right w:val="single" w:color="C9CFC9" w:sz="1"/>
+            </w:tcBorders>
+            <w:tcMar>
+              <w:top w:type="dxa" w:w="80"/>
+              <w:left w:type="dxa" w:w="120"/>
+              <w:bottom w:type="dxa" w:w="80"/>
+              <w:right w:type="dxa" w:w="120"/>
+            </w:tcMar>
+          </w:tcPr>
+          <w:p>
+            <w:r>
+              <w:rPr>
+                <w:b w:val="false"/>
+                <w:bCs w:val="false"/>
+              </w:rPr>
               <w:t xml:space="preserve">Tests</w:t>
             </w:r>
           </w:p>
@@ -2237,6 +2291,22 @@
     </w:p>
     <w:p>
       <w:pPr>
+        <w:spacing w:after="120"/>
+      </w:pPr>
+      <w:r>
+        <w:t xml:space="preserve">Printable packs: docs/print/ — one PDF per game part (cover, board page, host clue pages); generator tools/docgen/print_cards.py from boards.json (dump-boards.mjs).</w:t>
+      </w:r>
+    </w:p>
+    <w:p>
+      <w:pPr>
+        <w:spacing w:after="120"/>
+      </w:pPr>
+      <w:r>
+        <w:t xml:space="preserve">Printable packs: docs/print/ — one PDF per game part (cover, board page, host clue pages); generator tools/docgen/print_cards.py from boards.json (dump-boards.mjs).</w:t>
+      </w:r>
+    </w:p>
+    <w:p>
+      <w:pPr>
         <w:pStyle w:val="Heading2"/>
       </w:pPr>
       <w:bookmarkStart w:name="_Toc36" w:id="36"/>
@@ -3426,19 +3496,6 @@
       </w:pPr>
       <w:r>
         <w:t xml:space="preserve">Export/import stats (JSON) between devices.</w:t>
-      </w:r>
-    </w:p>
-    <w:p>
-      <w:pPr>
-        <w:pStyle w:val="ListParagraph"/>
-        <w:numPr>
-          <w:ilvl w:val="0"/>
-          <w:numId w:val="2"/>
-        </w:numPr>
-        <w:spacing w:after="60"/>
-      </w:pPr>
-      <w:r>
-        <w:t xml:space="preserve">Printable cards for offline play (PDF generated from boards).</w:t>
       </w:r>
     </w:p>
     <w:p>

</xml_diff>